<commit_message>
AUDITORIA_SILAIS - Primer avance
</commit_message>
<xml_diff>
--- a/PROYECTO FINAL/Guia de Auditoria de Sistemas. 2026.docx
+++ b/PROYECTO FINAL/Guia de Auditoria de Sistemas. 2026.docx
@@ -1,6 +1,6 @@
 
 <file path=word/document.xml><?xml version="1.0" encoding="utf-8"?>
-<w:document xmlns:wpc="http://schemas.microsoft.com/office/word/2010/wordprocessingCanvas" xmlns:cx="http://schemas.microsoft.com/office/drawing/2014/chartex" xmlns:cx1="http://schemas.microsoft.com/office/drawing/2015/9/8/chartex" xmlns:mc="http://schemas.openxmlformats.org/markup-compatibility/2006" xmlns:o="urn:schemas-microsoft-com:office:office" xmlns:r="http://schemas.openxmlformats.org/officeDocument/2006/relationships" xmlns:m="http://schemas.openxmlformats.org/officeDocument/2006/math" xmlns:v="urn:schemas-microsoft-com:vml" xmlns:wp14="http://schemas.microsoft.com/office/word/2010/wordprocessingDrawing" xmlns:wp="http://schemas.openxmlformats.org/drawingml/2006/wordprocessingDrawing" xmlns:w10="urn:schemas-microsoft-com:office:word" xmlns:w="http://schemas.openxmlformats.org/wordprocessingml/2006/main" xmlns:w14="http://schemas.microsoft.com/office/word/2010/wordml" xmlns:w15="http://schemas.microsoft.com/office/word/2012/wordml" xmlns:w16se="http://schemas.microsoft.com/office/word/2015/wordml/symex" xmlns:wpg="http://schemas.microsoft.com/office/word/2010/wordprocessingGroup" xmlns:wpi="http://schemas.microsoft.com/office/word/2010/wordprocessingInk" xmlns:wne="http://schemas.microsoft.com/office/word/2006/wordml" xmlns:wps="http://schemas.microsoft.com/office/word/2010/wordprocessingShape" mc:Ignorable="w14 w15 w16se wp14">
+<w:document xmlns:wpc="http://schemas.microsoft.com/office/word/2010/wordprocessingCanvas" xmlns:cx="http://schemas.microsoft.com/office/drawing/2014/chartex" xmlns:cx1="http://schemas.microsoft.com/office/drawing/2015/9/8/chartex" xmlns:cx2="http://schemas.microsoft.com/office/drawing/2015/10/21/chartex" xmlns:cx3="http://schemas.microsoft.com/office/drawing/2016/5/9/chartex" xmlns:cx4="http://schemas.microsoft.com/office/drawing/2016/5/10/chartex" xmlns:cx5="http://schemas.microsoft.com/office/drawing/2016/5/11/chartex" xmlns:cx6="http://schemas.microsoft.com/office/drawing/2016/5/12/chartex" xmlns:cx7="http://schemas.microsoft.com/office/drawing/2016/5/13/chartex" xmlns:cx8="http://schemas.microsoft.com/office/drawing/2016/5/14/chartex" xmlns:mc="http://schemas.openxmlformats.org/markup-compatibility/2006" xmlns:aink="http://schemas.microsoft.com/office/drawing/2016/ink" xmlns:am3d="http://schemas.microsoft.com/office/drawing/2017/model3d" xmlns:o="urn:schemas-microsoft-com:office:office" xmlns:r="http://schemas.openxmlformats.org/officeDocument/2006/relationships" xmlns:m="http://schemas.openxmlformats.org/officeDocument/2006/math" xmlns:v="urn:schemas-microsoft-com:vml" xmlns:wp14="http://schemas.microsoft.com/office/word/2010/wordprocessingDrawing" xmlns:wp="http://schemas.openxmlformats.org/drawingml/2006/wordprocessingDrawing" xmlns:w10="urn:schemas-microsoft-com:office:word" xmlns:w="http://schemas.openxmlformats.org/wordprocessingml/2006/main" xmlns:w14="http://schemas.microsoft.com/office/word/2010/wordml" xmlns:w15="http://schemas.microsoft.com/office/word/2012/wordml" xmlns:w16cex="http://schemas.microsoft.com/office/word/2018/wordml/cex" xmlns:w16cid="http://schemas.microsoft.com/office/word/2016/wordml/cid" xmlns:w16="http://schemas.microsoft.com/office/word/2018/wordml" xmlns:w16sdtdh="http://schemas.microsoft.com/office/word/2020/wordml/sdtdatahash" xmlns:w16se="http://schemas.microsoft.com/office/word/2015/wordml/symex" xmlns:wpg="http://schemas.microsoft.com/office/word/2010/wordprocessingGroup" xmlns:wpi="http://schemas.microsoft.com/office/word/2010/wordprocessingInk" xmlns:wne="http://schemas.microsoft.com/office/word/2006/wordml" xmlns:wps="http://schemas.microsoft.com/office/word/2010/wordprocessingShape" mc:Ignorable="w14 w15 w16se w16cid w16 w16cex w16sdtdh wp14">
   <w:body>
     <w:p>
       <w:pPr>
@@ -19,7 +19,7 @@
           <w:lang w:val="es-US" w:eastAsia="es-US"/>
         </w:rPr>
         <w:drawing>
-          <wp:inline distT="0" distB="0" distL="0" distR="0">
+          <wp:inline distT="0" distB="0" distL="0" distR="0" wp14:anchorId="7E0A86FC" wp14:editId="74E95A38">
             <wp:extent cx="2059612" cy="595122"/>
             <wp:effectExtent l="0" t="0" r="0" b="0"/>
             <wp:docPr id="1" name="Image 1"/>
@@ -250,6 +250,7 @@
           <w:b/>
           <w:color w:val="00AFEF"/>
         </w:rPr>
+        <w:lastRenderedPageBreak/>
         <w:t xml:space="preserve">       NINDIR</w:t>
       </w:r>
       <w:r>
@@ -268,8 +269,6 @@
         </w:rPr>
         <w:t>, MASAYA</w:t>
       </w:r>
-      <w:bookmarkStart w:id="0" w:name="_GoBack"/>
-      <w:bookmarkEnd w:id="0"/>
     </w:p>
     <w:p>
       <w:pPr>
@@ -553,27 +552,7 @@
                 <w:szCs w:val="24"/>
                 <w:lang w:val="es-NI"/>
               </w:rPr>
-              <w:t xml:space="preserve">Br. </w:t>
-            </w:r>
-            <w:proofErr w:type="spellStart"/>
-            <w:r>
-              <w:rPr>
-                <w:rFonts w:ascii="Arial" w:hAnsi="Arial" w:cs="Arial"/>
-                <w:sz w:val="24"/>
-                <w:szCs w:val="24"/>
-                <w:lang w:val="es-NI"/>
-              </w:rPr>
-              <w:t>Arleth</w:t>
-            </w:r>
-            <w:proofErr w:type="spellEnd"/>
-            <w:r>
-              <w:rPr>
-                <w:rFonts w:ascii="Arial" w:hAnsi="Arial" w:cs="Arial"/>
-                <w:sz w:val="24"/>
-                <w:szCs w:val="24"/>
-                <w:lang w:val="es-NI"/>
-              </w:rPr>
-              <w:t xml:space="preserve"> del Rosario Velásquez Gómez</w:t>
+              <w:t>Br. Arleth del Rosario Velásquez Gómez</w:t>
             </w:r>
           </w:p>
         </w:tc>
@@ -702,7 +681,6 @@
           <w:spacing w:val="-2"/>
           <w:sz w:val="24"/>
         </w:rPr>
-        <w:lastRenderedPageBreak/>
         <w:t>INTRODUCCIÓN</w:t>
       </w:r>
     </w:p>
@@ -748,23 +726,7 @@
           <w:rFonts w:ascii="Arial" w:hAnsi="Arial"/>
           <w:sz w:val="24"/>
         </w:rPr>
-        <w:t xml:space="preserve">El Instituto Ulises Tapia Roa, ubicado en </w:t>
-      </w:r>
-      <w:proofErr w:type="spellStart"/>
-      <w:r>
-        <w:rPr>
-          <w:rFonts w:ascii="Arial" w:hAnsi="Arial"/>
-          <w:sz w:val="24"/>
-        </w:rPr>
-        <w:t>Nindirí</w:t>
-      </w:r>
-      <w:proofErr w:type="spellEnd"/>
-      <w:r>
-        <w:rPr>
-          <w:rFonts w:ascii="Arial" w:hAnsi="Arial"/>
-          <w:sz w:val="24"/>
-        </w:rPr>
-        <w:t>, es un centro educativo que depende de las computadoras y el internet todos los días para funcionar. Tanto los profesores en el área administrativa como los estudiantes en el laboratorio de informática comparten recursos tecnológicos. Sin embargo, tener todos estos equipos conectados sin una revisión técnica y sin controles de seguridad adecuados puede ser un gran dolor de cabeza y un riesgo para la institución.</w:t>
+        <w:t>El Instituto Ulises Tapia Roa, ubicado en Nindirí, es un centro educativo que depende de las computadoras y el internet todos los días para funcionar. Tanto los profesores en el área administrativa como los estudiantes en el laboratorio de informática comparten recursos tecnológicos. Sin embargo, tener todos estos equipos conectados sin una revisión técnica y sin controles de seguridad adecuados puede ser un gran dolor de cabeza y un riesgo para la institución.</w:t>
       </w:r>
     </w:p>
     <w:p>
@@ -1218,7 +1180,6 @@
           <w:b/>
           <w:sz w:val="24"/>
         </w:rPr>
-        <w:lastRenderedPageBreak/>
         <w:t>OBJETIVOS</w:t>
       </w:r>
       <w:r>
@@ -1317,18 +1278,11 @@
         <w:ind w:left="566"/>
       </w:pPr>
       <w:r>
+        <w:lastRenderedPageBreak/>
         <w:t>Evaluar integralmente la infraestructura física y la arquitectura lógica de la red de datos del Instituto Ulises Tapia Roa</w:t>
       </w:r>
       <w:r>
-        <w:t xml:space="preserve"> ubicado en el municipio de </w:t>
-      </w:r>
-      <w:proofErr w:type="spellStart"/>
-      <w:r>
-        <w:t>Nindirí</w:t>
-      </w:r>
-      <w:proofErr w:type="spellEnd"/>
-      <w:r>
-        <w:t>.</w:t>
+        <w:t xml:space="preserve"> ubicado en el municipio de Nindirí.</w:t>
       </w:r>
     </w:p>
     <w:p>
@@ -1723,7 +1677,6 @@
           <w:spacing w:val="-2"/>
           <w:sz w:val="24"/>
         </w:rPr>
-        <w:lastRenderedPageBreak/>
         <w:t>JUSTIFICACIÓN</w:t>
       </w:r>
     </w:p>
@@ -1758,6 +1711,7 @@
           <w:szCs w:val="24"/>
           <w:lang w:val="es-US" w:eastAsia="es-US"/>
         </w:rPr>
+        <w:lastRenderedPageBreak/>
         <w:t>Llevar a cabo esta auditoría en el Instituto Ulises Tapia Roa nace de una necesidad práctica y urgente. Hoy en día, un colegio de secundaria depende totalmente de la tecnología para funcionar: desde el registro de notas hasta la planificación de los profesores. El problema principal es que, al tener a estudiantes y personal administrativo compartiendo la misma infraestructura de red sin una segmentación estructurada y sin controles de seguridad claros, la institución se expone a riesgos diarios. Hablamos de riesgos físicos, como equipos que pueden dañarse por malas instalaciones o las constantes fluctuaciones eléctricas en la zona; y riesgos lógicos graves, como la posibilidad de que los alumnos accedan a documentos confidenciales de la dirección o saturen el ancho de banda, dejando a los profesores sin poder trabajar. Si no se evalúa el estado actual de esta red, es solo cuestión de tiempo para que la información se comprometa o el servicio colapse.</w:t>
       </w:r>
     </w:p>
@@ -2178,7 +2132,6 @@
           <w:b/>
           <w:sz w:val="24"/>
         </w:rPr>
-        <w:lastRenderedPageBreak/>
         <w:t>PLANTEAMIENTO</w:t>
       </w:r>
       <w:r>
@@ -2277,21 +2230,7 @@
         <w:rPr>
           <w:rFonts w:ascii="Arial" w:hAnsi="Arial" w:cs="Arial"/>
         </w:rPr>
-        <w:t xml:space="preserve">, situado en el municipio de </w:t>
-      </w:r>
-      <w:proofErr w:type="spellStart"/>
-      <w:r>
-        <w:rPr>
-          <w:rFonts w:ascii="Arial" w:hAnsi="Arial" w:cs="Arial"/>
-        </w:rPr>
-        <w:t>Nindirí</w:t>
-      </w:r>
-      <w:proofErr w:type="spellEnd"/>
-      <w:r>
-        <w:rPr>
-          <w:rFonts w:ascii="Arial" w:hAnsi="Arial" w:cs="Arial"/>
-        </w:rPr>
-        <w:t>, la red LAN es la encargada de soportar esta carga dual. El problema central radica en la incertidumbre sobre la madurez y robustez de esta red para soportar dichas exigencias sin comprometer la seguridad o la disponibilidad del servicio.</w:t>
+        <w:t>, situado en el municipio de Nindirí, la red LAN es la encargada de soportar esta carga dual. El problema central radica en la incertidumbre sobre la madurez y robustez de esta red para soportar dichas exigencias sin comprometer la seguridad o la disponibilidad del servicio.</w:t>
       </w:r>
     </w:p>
     <w:p>
@@ -2361,21 +2300,7 @@
         <w:rPr>
           <w:rFonts w:ascii="Arial" w:hAnsi="Arial" w:cs="Arial"/>
         </w:rPr>
-        <w:t xml:space="preserve"> y exposición de los equipos de conmutación (</w:t>
-      </w:r>
-      <w:proofErr w:type="spellStart"/>
-      <w:r>
-        <w:rPr>
-          <w:rFonts w:ascii="Arial" w:hAnsi="Arial" w:cs="Arial"/>
-        </w:rPr>
-        <w:t>Switches</w:t>
-      </w:r>
-      <w:proofErr w:type="spellEnd"/>
-      <w:r>
-        <w:rPr>
-          <w:rFonts w:ascii="Arial" w:hAnsi="Arial" w:cs="Arial"/>
-        </w:rPr>
-        <w:t>/</w:t>
+        <w:t xml:space="preserve"> y exposición de los equipos de conmutación (Switches/</w:t>
       </w:r>
       <w:proofErr w:type="spellStart"/>
       <w:r>
@@ -2430,48 +2355,32 @@
         </w:rPr>
         <w:t xml:space="preserve">), lo que resulta en una red plana donde los virus o tormentas de </w:t>
       </w:r>
+      <w:r>
+        <w:rPr>
+          <w:rFonts w:ascii="Arial" w:hAnsi="Arial" w:cs="Arial"/>
+          <w:iCs/>
+        </w:rPr>
+        <w:t>broadcast</w:t>
+      </w:r>
+      <w:r>
+        <w:rPr>
+          <w:rFonts w:ascii="Arial" w:hAnsi="Arial" w:cs="Arial"/>
+        </w:rPr>
+        <w:t xml:space="preserve"> del laboratorio pueden paralizar las computadoras de la dirección; insuficiencia en la gestión del ancho de banda (</w:t>
+      </w:r>
       <w:proofErr w:type="spellStart"/>
       <w:r>
         <w:rPr>
           <w:rFonts w:ascii="Arial" w:hAnsi="Arial" w:cs="Arial"/>
-          <w:iCs/>
-        </w:rPr>
-        <w:t>broadcast</w:t>
+        </w:rPr>
+        <w:t>QoS</w:t>
       </w:r>
       <w:proofErr w:type="spellEnd"/>
       <w:r>
         <w:rPr>
           <w:rFonts w:ascii="Arial" w:hAnsi="Arial" w:cs="Arial"/>
         </w:rPr>
-        <w:t xml:space="preserve"> del laboratorio pueden paralizar las computadoras de la dirección; insuficiencia en la gestión del ancho de banda (</w:t>
-      </w:r>
-      <w:proofErr w:type="spellStart"/>
-      <w:r>
-        <w:rPr>
-          <w:rFonts w:ascii="Arial" w:hAnsi="Arial" w:cs="Arial"/>
-        </w:rPr>
-        <w:t>QoS</w:t>
-      </w:r>
-      <w:proofErr w:type="spellEnd"/>
-      <w:r>
-        <w:rPr>
-          <w:rFonts w:ascii="Arial" w:hAnsi="Arial" w:cs="Arial"/>
-        </w:rPr>
-        <w:t xml:space="preserve">), provocando embudos de datos que paralizan las funciones administrativas; y deficiencias en las políticas de restricción de usuarios, dejando a los equipos vulnerables a </w:t>
-      </w:r>
-      <w:proofErr w:type="spellStart"/>
-      <w:r>
-        <w:rPr>
-          <w:rFonts w:ascii="Arial" w:hAnsi="Arial" w:cs="Arial"/>
-        </w:rPr>
-        <w:t>desconfiguraciones</w:t>
-      </w:r>
-      <w:proofErr w:type="spellEnd"/>
-      <w:r>
-        <w:rPr>
-          <w:rFonts w:ascii="Arial" w:hAnsi="Arial" w:cs="Arial"/>
-        </w:rPr>
-        <w:t xml:space="preserve"> por parte de los alumnos.</w:t>
+        <w:t>), provocando embudos de datos que paralizan las funciones administrativas; y deficiencias en las políticas de restricción de usuarios, dejando a los equipos vulnerables a desconfiguraciones por parte de los alumnos.</w:t>
       </w:r>
     </w:p>
     <w:p>
@@ -3395,116 +3304,6 @@
     </w:p>
     <w:p>
       <w:pPr>
-        <w:pStyle w:val="NormalWeb"/>
-        <w:rPr>
-          <w:rFonts w:ascii="Arial" w:hAnsi="Arial" w:cs="Arial"/>
-        </w:rPr>
-      </w:pPr>
-    </w:p>
-    <w:p>
-      <w:pPr>
-        <w:pStyle w:val="NormalWeb"/>
-        <w:rPr>
-          <w:rFonts w:ascii="Arial" w:hAnsi="Arial" w:cs="Arial"/>
-        </w:rPr>
-      </w:pPr>
-    </w:p>
-    <w:p>
-      <w:pPr>
-        <w:tabs>
-          <w:tab w:val="left" w:pos="927"/>
-        </w:tabs>
-        <w:rPr>
-          <w:rFonts w:ascii="Arial" w:hAnsi="Arial"/>
-          <w:b/>
-          <w:sz w:val="24"/>
-          <w:lang w:val="es-US"/>
-        </w:rPr>
-      </w:pPr>
-    </w:p>
-    <w:p>
-      <w:pPr>
-        <w:tabs>
-          <w:tab w:val="left" w:pos="927"/>
-        </w:tabs>
-        <w:rPr>
-          <w:rFonts w:ascii="Arial" w:hAnsi="Arial"/>
-          <w:b/>
-          <w:sz w:val="24"/>
-          <w:lang w:val="es-US"/>
-        </w:rPr>
-      </w:pPr>
-    </w:p>
-    <w:p>
-      <w:pPr>
-        <w:tabs>
-          <w:tab w:val="left" w:pos="927"/>
-        </w:tabs>
-        <w:rPr>
-          <w:rFonts w:ascii="Arial" w:hAnsi="Arial"/>
-          <w:b/>
-          <w:sz w:val="24"/>
-          <w:lang w:val="es-US"/>
-        </w:rPr>
-      </w:pPr>
-    </w:p>
-    <w:p>
-      <w:pPr>
-        <w:pStyle w:val="Textoindependiente"/>
-        <w:rPr>
-          <w:rFonts w:ascii="Arial"/>
-          <w:b/>
-        </w:rPr>
-      </w:pPr>
-    </w:p>
-    <w:p>
-      <w:pPr>
-        <w:pStyle w:val="Textoindependiente"/>
-        <w:rPr>
-          <w:rFonts w:ascii="Arial"/>
-          <w:b/>
-        </w:rPr>
-      </w:pPr>
-    </w:p>
-    <w:p>
-      <w:pPr>
-        <w:pStyle w:val="Textoindependiente"/>
-        <w:rPr>
-          <w:rFonts w:ascii="Arial"/>
-          <w:b/>
-        </w:rPr>
-      </w:pPr>
-    </w:p>
-    <w:p>
-      <w:pPr>
-        <w:pStyle w:val="Textoindependiente"/>
-        <w:rPr>
-          <w:rFonts w:ascii="Arial"/>
-          <w:b/>
-        </w:rPr>
-      </w:pPr>
-    </w:p>
-    <w:p>
-      <w:pPr>
-        <w:pStyle w:val="Textoindependiente"/>
-        <w:rPr>
-          <w:rFonts w:ascii="Arial"/>
-          <w:b/>
-        </w:rPr>
-      </w:pPr>
-    </w:p>
-    <w:p>
-      <w:pPr>
-        <w:pStyle w:val="Textoindependiente"/>
-        <w:spacing w:before="44"/>
-        <w:rPr>
-          <w:rFonts w:ascii="Arial"/>
-          <w:b/>
-        </w:rPr>
-      </w:pPr>
-    </w:p>
-    <w:p>
-      <w:pPr>
         <w:pStyle w:val="Prrafodelista"/>
         <w:numPr>
           <w:ilvl w:val="0"/>
@@ -3527,6 +3326,7 @@
           <w:b/>
           <w:sz w:val="24"/>
         </w:rPr>
+        <w:lastRenderedPageBreak/>
         <w:t>MARCO</w:t>
       </w:r>
       <w:r>
@@ -3835,12 +3635,16 @@
         <w:pStyle w:val="Textoindependiente"/>
         <w:spacing w:line="275" w:lineRule="exact"/>
         <w:ind w:left="927"/>
-      </w:pPr>
-      <w:r>
         <w:rPr>
           <w:color w:val="001F5F"/>
           <w:spacing w:val="-2"/>
         </w:rPr>
+      </w:pPr>
+      <w:r>
+        <w:rPr>
+          <w:color w:val="001F5F"/>
+          <w:spacing w:val="-2"/>
+        </w:rPr>
         <w:t>Misión</w:t>
       </w:r>
     </w:p>
@@ -3848,18 +3652,6 @@
       <w:pPr>
         <w:pStyle w:val="Textoindependiente"/>
         <w:spacing w:line="275" w:lineRule="exact"/>
-        <w:sectPr>
-          <w:type w:val="continuous"/>
-          <w:pgSz w:w="11910" w:h="16840"/>
-          <w:pgMar w:top="720" w:right="1275" w:bottom="280" w:left="566" w:header="720" w:footer="720" w:gutter="0"/>
-          <w:cols w:space="720"/>
-        </w:sectPr>
-      </w:pPr>
-    </w:p>
-    <w:p>
-      <w:pPr>
-        <w:pStyle w:val="Textoindependiente"/>
-        <w:spacing w:before="82"/>
         <w:ind w:left="927"/>
       </w:pPr>
       <w:r>
@@ -3867,7 +3659,6 @@
           <w:color w:val="001F5F"/>
           <w:spacing w:val="-2"/>
         </w:rPr>
-        <w:lastRenderedPageBreak/>
         <w:t>Visión</w:t>
       </w:r>
     </w:p>
@@ -5370,6 +5161,7 @@
           <w:color w:val="001F5F"/>
           <w:spacing w:val="-2"/>
         </w:rPr>
+        <w:lastRenderedPageBreak/>
         <w:t>auditoría.</w:t>
       </w:r>
     </w:p>
@@ -5401,24 +5193,53 @@
           <w:color w:val="001F5F"/>
           <w:sz w:val="24"/>
         </w:rPr>
-        <w:t>TRABAJO DE AUDITORÍA PLAN DE AUDITORÍA</w:t>
+        <w:t>TRABAJO DE</w:t>
+      </w:r>
+      <w:r>
+        <w:rPr>
+          <w:rFonts w:ascii="Arial" w:hAnsi="Arial"/>
+          <w:b/>
+          <w:color w:val="001F5F"/>
+          <w:sz w:val="24"/>
+        </w:rPr>
+        <w:t>A</w:t>
+      </w:r>
+      <w:r>
+        <w:rPr>
+          <w:rFonts w:ascii="Arial" w:hAnsi="Arial"/>
+          <w:b/>
+          <w:color w:val="001F5F"/>
+          <w:sz w:val="24"/>
+        </w:rPr>
+        <w:t xml:space="preserve">UDITORÍA </w:t>
       </w:r>
     </w:p>
     <w:p>
       <w:pPr>
         <w:pStyle w:val="Prrafodelista"/>
-        <w:spacing w:line="720" w:lineRule="auto"/>
-        <w:rPr>
-          <w:rFonts w:ascii="Arial" w:hAnsi="Arial"/>
-          <w:b/>
-          <w:sz w:val="24"/>
-        </w:rPr>
-        <w:sectPr>
-          <w:pgSz w:w="11910" w:h="16840"/>
-          <w:pgMar w:top="1340" w:right="1275" w:bottom="280" w:left="566" w:header="720" w:footer="720" w:gutter="0"/>
-          <w:cols w:space="720"/>
-        </w:sectPr>
-      </w:pPr>
+        <w:tabs>
+          <w:tab w:val="left" w:pos="566"/>
+          <w:tab w:val="left" w:pos="927"/>
+        </w:tabs>
+        <w:spacing w:before="201" w:line="720" w:lineRule="auto"/>
+        <w:ind w:left="566" w:right="6189" w:firstLine="0"/>
+        <w:jc w:val="right"/>
+        <w:rPr>
+          <w:rFonts w:ascii="Arial" w:hAnsi="Arial"/>
+          <w:b/>
+          <w:color w:val="001F5F"/>
+          <w:sz w:val="24"/>
+        </w:rPr>
+      </w:pPr>
+      <w:r>
+        <w:rPr>
+          <w:rFonts w:ascii="Arial" w:hAnsi="Arial"/>
+          <w:b/>
+          <w:color w:val="001F5F"/>
+          <w:sz w:val="24"/>
+        </w:rPr>
+        <w:t>PLAN DE AUDITORÍA</w:t>
+      </w:r>
     </w:p>
     <w:p>
       <w:pPr>
@@ -5437,7 +5258,15 @@
           <w:color w:val="001F5F"/>
           <w:sz w:val="24"/>
         </w:rPr>
-        <w:lastRenderedPageBreak/>
+        <w:t xml:space="preserve">            </w:t>
+      </w:r>
+      <w:r>
+        <w:rPr>
+          <w:rFonts w:ascii="Arial" w:hAnsi="Arial"/>
+          <w:b/>
+          <w:color w:val="001F5F"/>
+          <w:sz w:val="24"/>
+        </w:rPr>
         <w:t>PROGRAMAS</w:t>
       </w:r>
       <w:r>
@@ -6546,7 +6375,7 @@
 </file>
 
 <file path=word/numbering.xml><?xml version="1.0" encoding="utf-8"?>
-<w:numbering xmlns:wpc="http://schemas.microsoft.com/office/word/2010/wordprocessingCanvas" xmlns:cx="http://schemas.microsoft.com/office/drawing/2014/chartex" xmlns:cx1="http://schemas.microsoft.com/office/drawing/2015/9/8/chartex" xmlns:mc="http://schemas.openxmlformats.org/markup-compatibility/2006" xmlns:o="urn:schemas-microsoft-com:office:office" xmlns:r="http://schemas.openxmlformats.org/officeDocument/2006/relationships" xmlns:m="http://schemas.openxmlformats.org/officeDocument/2006/math" xmlns:v="urn:schemas-microsoft-com:vml" xmlns:wp14="http://schemas.microsoft.com/office/word/2010/wordprocessingDrawing" xmlns:wp="http://schemas.openxmlformats.org/drawingml/2006/wordprocessingDrawing" xmlns:w10="urn:schemas-microsoft-com:office:word" xmlns:w="http://schemas.openxmlformats.org/wordprocessingml/2006/main" xmlns:w14="http://schemas.microsoft.com/office/word/2010/wordml" xmlns:w15="http://schemas.microsoft.com/office/word/2012/wordml" xmlns:w16se="http://schemas.microsoft.com/office/word/2015/wordml/symex" xmlns:wpg="http://schemas.microsoft.com/office/word/2010/wordprocessingGroup" xmlns:wpi="http://schemas.microsoft.com/office/word/2010/wordprocessingInk" xmlns:wne="http://schemas.microsoft.com/office/word/2006/wordml" xmlns:wps="http://schemas.microsoft.com/office/word/2010/wordprocessingShape" mc:Ignorable="w14 w15 w16se wp14">
+<w:numbering xmlns:wpc="http://schemas.microsoft.com/office/word/2010/wordprocessingCanvas" xmlns:cx="http://schemas.microsoft.com/office/drawing/2014/chartex" xmlns:cx1="http://schemas.microsoft.com/office/drawing/2015/9/8/chartex" xmlns:cx2="http://schemas.microsoft.com/office/drawing/2015/10/21/chartex" xmlns:cx3="http://schemas.microsoft.com/office/drawing/2016/5/9/chartex" xmlns:cx4="http://schemas.microsoft.com/office/drawing/2016/5/10/chartex" xmlns:cx5="http://schemas.microsoft.com/office/drawing/2016/5/11/chartex" xmlns:cx6="http://schemas.microsoft.com/office/drawing/2016/5/12/chartex" xmlns:cx7="http://schemas.microsoft.com/office/drawing/2016/5/13/chartex" xmlns:cx8="http://schemas.microsoft.com/office/drawing/2016/5/14/chartex" xmlns:mc="http://schemas.openxmlformats.org/markup-compatibility/2006" xmlns:aink="http://schemas.microsoft.com/office/drawing/2016/ink" xmlns:am3d="http://schemas.microsoft.com/office/drawing/2017/model3d" xmlns:o="urn:schemas-microsoft-com:office:office" xmlns:r="http://schemas.openxmlformats.org/officeDocument/2006/relationships" xmlns:m="http://schemas.openxmlformats.org/officeDocument/2006/math" xmlns:v="urn:schemas-microsoft-com:vml" xmlns:wp14="http://schemas.microsoft.com/office/word/2010/wordprocessingDrawing" xmlns:wp="http://schemas.openxmlformats.org/drawingml/2006/wordprocessingDrawing" xmlns:w10="urn:schemas-microsoft-com:office:word" xmlns:w="http://schemas.openxmlformats.org/wordprocessingml/2006/main" xmlns:w14="http://schemas.microsoft.com/office/word/2010/wordml" xmlns:w15="http://schemas.microsoft.com/office/word/2012/wordml" xmlns:w16cex="http://schemas.microsoft.com/office/word/2018/wordml/cex" xmlns:w16cid="http://schemas.microsoft.com/office/word/2016/wordml/cid" xmlns:w16="http://schemas.microsoft.com/office/word/2018/wordml" xmlns:w16sdtdh="http://schemas.microsoft.com/office/word/2020/wordml/sdtdatahash" xmlns:w16se="http://schemas.microsoft.com/office/word/2015/wordml/symex" xmlns:wpg="http://schemas.microsoft.com/office/word/2010/wordprocessingGroup" xmlns:wpi="http://schemas.microsoft.com/office/word/2010/wordprocessingInk" xmlns:wne="http://schemas.microsoft.com/office/word/2006/wordml" xmlns:wps="http://schemas.microsoft.com/office/word/2010/wordprocessingShape" mc:Ignorable="w14 w15 w16se w16cid w16 w16cex w16sdtdh wp14">
   <w:abstractNum w:abstractNumId="0" w15:restartNumberingAfterBreak="0">
     <w:nsid w:val="1AD22316"/>
     <w:multiLevelType w:val="hybridMultilevel"/>
@@ -7261,7 +7090,7 @@
 </file>
 
 <file path=word/styles.xml><?xml version="1.0" encoding="utf-8"?>
-<w:styles xmlns:mc="http://schemas.openxmlformats.org/markup-compatibility/2006" xmlns:r="http://schemas.openxmlformats.org/officeDocument/2006/relationships" xmlns:w="http://schemas.openxmlformats.org/wordprocessingml/2006/main" xmlns:w14="http://schemas.microsoft.com/office/word/2010/wordml" xmlns:w15="http://schemas.microsoft.com/office/word/2012/wordml" xmlns:w16se="http://schemas.microsoft.com/office/word/2015/wordml/symex" mc:Ignorable="w14 w15 w16se">
+<w:styles xmlns:mc="http://schemas.openxmlformats.org/markup-compatibility/2006" xmlns:r="http://schemas.openxmlformats.org/officeDocument/2006/relationships" xmlns:w="http://schemas.openxmlformats.org/wordprocessingml/2006/main" xmlns:w14="http://schemas.microsoft.com/office/word/2010/wordml" xmlns:w15="http://schemas.microsoft.com/office/word/2012/wordml" xmlns:w16cex="http://schemas.microsoft.com/office/word/2018/wordml/cex" xmlns:w16cid="http://schemas.microsoft.com/office/word/2016/wordml/cid" xmlns:w16="http://schemas.microsoft.com/office/word/2018/wordml" xmlns:w16sdtdh="http://schemas.microsoft.com/office/word/2020/wordml/sdtdatahash" xmlns:w16se="http://schemas.microsoft.com/office/word/2015/wordml/symex" mc:Ignorable="w14 w15 w16se w16cid w16 w16cex w16sdtdh">
   <w:docDefaults>
     <w:rPrDefault>
       <w:rPr>
@@ -7279,7 +7108,7 @@
       </w:pPr>
     </w:pPrDefault>
   </w:docDefaults>
-  <w:latentStyles w:defLockedState="0" w:defUIPriority="99" w:defSemiHidden="0" w:defUnhideWhenUsed="0" w:defQFormat="0" w:count="371">
+  <w:latentStyles w:defLockedState="0" w:defUIPriority="99" w:defSemiHidden="0" w:defUnhideWhenUsed="0" w:defQFormat="0" w:count="376">
     <w:lsdException w:name="Normal" w:uiPriority="0" w:qFormat="1"/>
     <w:lsdException w:name="heading 1" w:uiPriority="9" w:qFormat="1"/>
     <w:lsdException w:name="heading 2" w:semiHidden="1" w:uiPriority="9" w:unhideWhenUsed="1" w:qFormat="1"/>
@@ -7385,7 +7214,6 @@
     <w:lsdException w:name="HTML Sample" w:semiHidden="1" w:unhideWhenUsed="1"/>
     <w:lsdException w:name="HTML Typewriter" w:semiHidden="1" w:unhideWhenUsed="1"/>
     <w:lsdException w:name="HTML Variable" w:semiHidden="1" w:unhideWhenUsed="1"/>
-    <w:lsdException w:name="Normal Table" w:semiHidden="1" w:unhideWhenUsed="1"/>
     <w:lsdException w:name="annotation subject" w:semiHidden="1" w:unhideWhenUsed="1"/>
     <w:lsdException w:name="No List" w:semiHidden="1" w:unhideWhenUsed="1"/>
     <w:lsdException w:name="Outline List 1" w:semiHidden="1" w:unhideWhenUsed="1"/>
@@ -7428,11 +7256,8 @@
     <w:lsdException w:name="Table Contemporary" w:semiHidden="1" w:unhideWhenUsed="1"/>
     <w:lsdException w:name="Table Elegant" w:semiHidden="1" w:unhideWhenUsed="1"/>
     <w:lsdException w:name="Table Professional" w:semiHidden="1" w:unhideWhenUsed="1"/>
-    <w:lsdException w:name="Table Subtle 1" w:semiHidden="1" w:unhideWhenUsed="1"/>
     <w:lsdException w:name="Table Subtle 2" w:semiHidden="1" w:unhideWhenUsed="1"/>
     <w:lsdException w:name="Table Web 1" w:semiHidden="1" w:unhideWhenUsed="1"/>
-    <w:lsdException w:name="Table Web 2" w:semiHidden="1" w:unhideWhenUsed="1"/>
-    <w:lsdException w:name="Table Web 3" w:semiHidden="1" w:unhideWhenUsed="1"/>
     <w:lsdException w:name="Balloon Text" w:semiHidden="1" w:unhideWhenUsed="1"/>
     <w:lsdException w:name="Table Grid" w:uiPriority="39"/>
     <w:lsdException w:name="Table Theme" w:semiHidden="1" w:unhideWhenUsed="1"/>
@@ -7651,6 +7476,11 @@
     <w:lsdException w:name="List Table 5 Dark Accent 6" w:uiPriority="50"/>
     <w:lsdException w:name="List Table 6 Colorful Accent 6" w:uiPriority="51"/>
     <w:lsdException w:name="List Table 7 Colorful Accent 6" w:uiPriority="52"/>
+    <w:lsdException w:name="Mention" w:semiHidden="1" w:unhideWhenUsed="1"/>
+    <w:lsdException w:name="Smart Hyperlink" w:semiHidden="1" w:unhideWhenUsed="1"/>
+    <w:lsdException w:name="Hashtag" w:semiHidden="1" w:unhideWhenUsed="1"/>
+    <w:lsdException w:name="Unresolved Mention" w:semiHidden="1" w:unhideWhenUsed="1"/>
+    <w:lsdException w:name="Smart Link" w:semiHidden="1" w:unhideWhenUsed="1"/>
   </w:latentStyles>
   <w:style w:type="paragraph" w:default="1" w:styleId="Normal">
     <w:name w:val="Normal"/>

</xml_diff>